<commit_message>
Align manuscript with Wiley free-format requirements
</commit_message>
<xml_diff>
--- a/manuscript/CS_SHAP_V2_Two_Dataset_Manuscript.docx
+++ b/manuscript/CS_SHAP_V2_Two_Dataset_Manuscript.docx
@@ -16,6 +16,20 @@
           <w:sz w:val="40"/>
         </w:rPr>
         <w:t>Minority-Aware Stable SHAP Feature Selection for Multiclass IoT Intrusion Detection: Nested Validation Across Edge-IIoTset and TON_IoT</w:t>
+      </w:r>
+    </w:p>
+    <w:p>
+      <w:pPr>
+        <w:widowControl/>
+        <w:spacing w:after="160"/>
+        <w:jc w:val="center"/>
+      </w:pPr>
+      <w:r>
+        <w:rPr>
+          <w:i/>
+          <w:sz w:val="20"/>
+        </w:rPr>
+        <w:t>Running title: Stable SHAP for IoT Security</w:t>
       </w:r>
     </w:p>
     <w:p>
@@ -79,7 +93,46 @@
         <w:widowControl/>
       </w:pPr>
       <w:r>
-        <w:t>Keywords: explainable artificial intelligence; SHAP; feature selection; intrusion detection; class imbalance; stability; Edge-IIoTset; TON_IoT</w:t>
+        <w:t>Keywords: explainable artificial intelligence; SHAP; feature selection; intrusion detection; class imbalance; selection stability; IoT security</w:t>
+      </w:r>
+    </w:p>
+    <w:p>
+      <w:pPr>
+        <w:pStyle w:val="Heading1"/>
+        <w:widowControl/>
+      </w:pPr>
+      <w:r>
+        <w:t>Practitioner Points</w:t>
+      </w:r>
+    </w:p>
+    <w:p>
+      <w:pPr>
+        <w:pStyle w:val="ListBullet"/>
+        <w:widowControl/>
+        <w:spacing w:after="100"/>
+      </w:pPr>
+      <w:r>
+        <w:t>Security teams can reduce the monitored predictor set by approximately 56% while preserving XGBoost macro-F1 across two public IoT intrusion-detection benchmarks.</w:t>
+      </w:r>
+    </w:p>
+    <w:p>
+      <w:pPr>
+        <w:pStyle w:val="ListBullet"/>
+        <w:widowControl/>
+        <w:spacing w:after="100"/>
+      </w:pPr>
+      <w:r>
+        <w:t>Recurrence constraints identify a repeatable feature core, while minority-conditioned additions help protect low-support attack classes from being suppressed by global rankings.</w:t>
+      </w:r>
+    </w:p>
+    <w:p>
+      <w:pPr>
+        <w:pStyle w:val="ListBullet"/>
+        <w:widowControl/>
+        <w:spacing w:after="100"/>
+      </w:pPr>
+      <w:r>
+        <w:t>The selected representation is model-dependent; practitioners should recompute or revalidate the subset before changing classifier families or deployment environments.</w:t>
       </w:r>
     </w:p>
     <w:p>

</xml_diff>